<commit_message>
docs: formalize STD v1.0.1 with A21s acceptance PASS, sign-off date, and harmonized SRS wording
</commit_message>
<xml_diff>
--- a/docs/submission/playIT_SRS_v3.0.docx
+++ b/docs/submission/playIT_SRS_v3.0.docx
@@ -12,7 +12,7 @@
           <w:noProof/>
         </w:rPr>
         <w:drawing>
-          <wp:inline distT="0" distB="0" distL="0" distR="0" wp14:anchorId="0740F97E" wp14:editId="62AFF831">
+          <wp:inline distT="0" distB="0" distL="0" distR="0" wp14:anchorId="6BCBA0C1" wp14:editId="7DE2F828">
             <wp:extent cx="1463040" cy="1034415"/>
             <wp:effectExtent l="0" t="0" r="0" b="0"/>
             <wp:docPr id="1" name="Picture 1"/>
@@ -403,7 +403,7 @@
       <w:r>
         <w:fldChar w:fldCharType="separate"/>
       </w:r>
-      <w:hyperlink w:anchor="_Toc243212122" w:history="1">
+      <w:hyperlink w:anchor="_Toc243245953" w:history="1">
         <w:r>
           <w:rPr>
             <w:rStyle w:val="Hyperlink"/>
@@ -430,7 +430,7 @@
             <w:noProof/>
             <w:webHidden/>
           </w:rPr>
-          <w:instrText xml:space="preserve"> PAGEREF _Toc243212122 \h </w:instrText>
+          <w:instrText xml:space="preserve"> PAGEREF _Toc243245953 \h </w:instrText>
         </w:r>
         <w:r>
           <w:rPr>
@@ -478,7 +478,7 @@
           <w14:ligatures w14:val="standardContextual"/>
         </w:rPr>
       </w:pPr>
-      <w:hyperlink w:anchor="_Toc243212123" w:history="1">
+      <w:hyperlink w:anchor="_Toc243245954" w:history="1">
         <w:r>
           <w:rPr>
             <w:rStyle w:val="Hyperlink"/>
@@ -505,7 +505,7 @@
             <w:noProof/>
             <w:webHidden/>
           </w:rPr>
-          <w:instrText xml:space="preserve"> PAGEREF _Toc243212123 \h </w:instrText>
+          <w:instrText xml:space="preserve"> PAGEREF _Toc243245954 \h </w:instrText>
         </w:r>
         <w:r>
           <w:rPr>
@@ -553,7 +553,7 @@
           <w14:ligatures w14:val="standardContextual"/>
         </w:rPr>
       </w:pPr>
-      <w:hyperlink w:anchor="_Toc243212124" w:history="1">
+      <w:hyperlink w:anchor="_Toc243245955" w:history="1">
         <w:r>
           <w:rPr>
             <w:rStyle w:val="Hyperlink"/>
@@ -580,7 +580,7 @@
             <w:noProof/>
             <w:webHidden/>
           </w:rPr>
-          <w:instrText xml:space="preserve"> PAGEREF _Toc243212124 \h </w:instrText>
+          <w:instrText xml:space="preserve"> PAGEREF _Toc243245955 \h </w:instrText>
         </w:r>
         <w:r>
           <w:rPr>
@@ -628,7 +628,7 @@
           <w14:ligatures w14:val="standardContextual"/>
         </w:rPr>
       </w:pPr>
-      <w:hyperlink w:anchor="_Toc243212125" w:history="1">
+      <w:hyperlink w:anchor="_Toc243245956" w:history="1">
         <w:r>
           <w:rPr>
             <w:rStyle w:val="Hyperlink"/>
@@ -655,7 +655,7 @@
             <w:noProof/>
             <w:webHidden/>
           </w:rPr>
-          <w:instrText xml:space="preserve"> PAGEREF _Toc243212125 \h </w:instrText>
+          <w:instrText xml:space="preserve"> PAGEREF _Toc243245956 \h </w:instrText>
         </w:r>
         <w:r>
           <w:rPr>
@@ -703,7 +703,7 @@
           <w14:ligatures w14:val="standardContextual"/>
         </w:rPr>
       </w:pPr>
-      <w:hyperlink w:anchor="_Toc243212126" w:history="1">
+      <w:hyperlink w:anchor="_Toc243245957" w:history="1">
         <w:r>
           <w:rPr>
             <w:rStyle w:val="Hyperlink"/>
@@ -730,7 +730,7 @@
             <w:noProof/>
             <w:webHidden/>
           </w:rPr>
-          <w:instrText xml:space="preserve"> PAGEREF _Toc243212126 \h </w:instrText>
+          <w:instrText xml:space="preserve"> PAGEREF _Toc243245957 \h </w:instrText>
         </w:r>
         <w:r>
           <w:rPr>
@@ -778,7 +778,7 @@
           <w14:ligatures w14:val="standardContextual"/>
         </w:rPr>
       </w:pPr>
-      <w:hyperlink w:anchor="_Toc243212127" w:history="1">
+      <w:hyperlink w:anchor="_Toc243245958" w:history="1">
         <w:r>
           <w:rPr>
             <w:rStyle w:val="Hyperlink"/>
@@ -805,7 +805,7 @@
             <w:noProof/>
             <w:webHidden/>
           </w:rPr>
-          <w:instrText xml:space="preserve"> PAGEREF _Toc243212127 \h </w:instrText>
+          <w:instrText xml:space="preserve"> PAGEREF _Toc243245958 \h </w:instrText>
         </w:r>
         <w:r>
           <w:rPr>
@@ -853,7 +853,7 @@
           <w14:ligatures w14:val="standardContextual"/>
         </w:rPr>
       </w:pPr>
-      <w:hyperlink w:anchor="_Toc243212128" w:history="1">
+      <w:hyperlink w:anchor="_Toc243245959" w:history="1">
         <w:r>
           <w:rPr>
             <w:rStyle w:val="Hyperlink"/>
@@ -880,7 +880,7 @@
             <w:noProof/>
             <w:webHidden/>
           </w:rPr>
-          <w:instrText xml:space="preserve"> PAGEREF _Toc243212128 \h </w:instrText>
+          <w:instrText xml:space="preserve"> PAGEREF _Toc243245959 \h </w:instrText>
         </w:r>
         <w:r>
           <w:rPr>
@@ -928,7 +928,7 @@
           <w14:ligatures w14:val="standardContextual"/>
         </w:rPr>
       </w:pPr>
-      <w:hyperlink w:anchor="_Toc243212129" w:history="1">
+      <w:hyperlink w:anchor="_Toc243245960" w:history="1">
         <w:r>
           <w:rPr>
             <w:rStyle w:val="Hyperlink"/>
@@ -955,7 +955,7 @@
             <w:noProof/>
             <w:webHidden/>
           </w:rPr>
-          <w:instrText xml:space="preserve"> PAGEREF _Toc243212129 \h </w:instrText>
+          <w:instrText xml:space="preserve"> PAGEREF _Toc243245960 \h </w:instrText>
         </w:r>
         <w:r>
           <w:rPr>
@@ -1003,7 +1003,7 @@
           <w14:ligatures w14:val="standardContextual"/>
         </w:rPr>
       </w:pPr>
-      <w:hyperlink w:anchor="_Toc243212130" w:history="1">
+      <w:hyperlink w:anchor="_Toc243245961" w:history="1">
         <w:r>
           <w:rPr>
             <w:rStyle w:val="Hyperlink"/>
@@ -1030,7 +1030,7 @@
             <w:noProof/>
             <w:webHidden/>
           </w:rPr>
-          <w:instrText xml:space="preserve"> PAGEREF _Toc243212130 \h </w:instrText>
+          <w:instrText xml:space="preserve"> PAGEREF _Toc243245961 \h </w:instrText>
         </w:r>
         <w:r>
           <w:rPr>
@@ -1078,7 +1078,7 @@
           <w14:ligatures w14:val="standardContextual"/>
         </w:rPr>
       </w:pPr>
-      <w:hyperlink w:anchor="_Toc243212131" w:history="1">
+      <w:hyperlink w:anchor="_Toc243245962" w:history="1">
         <w:r>
           <w:rPr>
             <w:rStyle w:val="Hyperlink"/>
@@ -1105,7 +1105,7 @@
             <w:noProof/>
             <w:webHidden/>
           </w:rPr>
-          <w:instrText xml:space="preserve"> PAGEREF _Toc243212131 \h </w:instrText>
+          <w:instrText xml:space="preserve"> PAGEREF _Toc243245962 \h </w:instrText>
         </w:r>
         <w:r>
           <w:rPr>
@@ -1153,7 +1153,7 @@
           <w14:ligatures w14:val="standardContextual"/>
         </w:rPr>
       </w:pPr>
-      <w:hyperlink w:anchor="_Toc243212132" w:history="1">
+      <w:hyperlink w:anchor="_Toc243245963" w:history="1">
         <w:r>
           <w:rPr>
             <w:rStyle w:val="Hyperlink"/>
@@ -1180,7 +1180,7 @@
             <w:noProof/>
             <w:webHidden/>
           </w:rPr>
-          <w:instrText xml:space="preserve"> PAGEREF _Toc243212132 \h </w:instrText>
+          <w:instrText xml:space="preserve"> PAGEREF _Toc243245963 \h </w:instrText>
         </w:r>
         <w:r>
           <w:rPr>
@@ -1228,7 +1228,7 @@
           <w14:ligatures w14:val="standardContextual"/>
         </w:rPr>
       </w:pPr>
-      <w:hyperlink w:anchor="_Toc243212133" w:history="1">
+      <w:hyperlink w:anchor="_Toc243245964" w:history="1">
         <w:r>
           <w:rPr>
             <w:rStyle w:val="Hyperlink"/>
@@ -1255,7 +1255,7 @@
             <w:noProof/>
             <w:webHidden/>
           </w:rPr>
-          <w:instrText xml:space="preserve"> PAGEREF _Toc243212133 \h </w:instrText>
+          <w:instrText xml:space="preserve"> PAGEREF _Toc243245964 \h </w:instrText>
         </w:r>
         <w:r>
           <w:rPr>
@@ -1303,7 +1303,7 @@
           <w14:ligatures w14:val="standardContextual"/>
         </w:rPr>
       </w:pPr>
-      <w:hyperlink w:anchor="_Toc243212134" w:history="1">
+      <w:hyperlink w:anchor="_Toc243245965" w:history="1">
         <w:r>
           <w:rPr>
             <w:rStyle w:val="Hyperlink"/>
@@ -1330,7 +1330,7 @@
             <w:noProof/>
             <w:webHidden/>
           </w:rPr>
-          <w:instrText xml:space="preserve"> PAGEREF _Toc243212134 \h </w:instrText>
+          <w:instrText xml:space="preserve"> PAGEREF _Toc243245965 \h </w:instrText>
         </w:r>
         <w:r>
           <w:rPr>
@@ -1378,7 +1378,7 @@
           <w14:ligatures w14:val="standardContextual"/>
         </w:rPr>
       </w:pPr>
-      <w:hyperlink w:anchor="_Toc243212135" w:history="1">
+      <w:hyperlink w:anchor="_Toc243245966" w:history="1">
         <w:r>
           <w:rPr>
             <w:rStyle w:val="Hyperlink"/>
@@ -1405,7 +1405,7 @@
             <w:noProof/>
             <w:webHidden/>
           </w:rPr>
-          <w:instrText xml:space="preserve"> PAGEREF _Toc243212135 \h </w:instrText>
+          <w:instrText xml:space="preserve"> PAGEREF _Toc243245966 \h </w:instrText>
         </w:r>
         <w:r>
           <w:rPr>
@@ -1453,7 +1453,7 @@
           <w14:ligatures w14:val="standardContextual"/>
         </w:rPr>
       </w:pPr>
-      <w:hyperlink w:anchor="_Toc243212136" w:history="1">
+      <w:hyperlink w:anchor="_Toc243245967" w:history="1">
         <w:r>
           <w:rPr>
             <w:rStyle w:val="Hyperlink"/>
@@ -1480,7 +1480,7 @@
             <w:noProof/>
             <w:webHidden/>
           </w:rPr>
-          <w:instrText xml:space="preserve"> PAGEREF _Toc243212136 \h </w:instrText>
+          <w:instrText xml:space="preserve"> PAGEREF _Toc243245967 \h </w:instrText>
         </w:r>
         <w:r>
           <w:rPr>
@@ -1528,7 +1528,7 @@
           <w14:ligatures w14:val="standardContextual"/>
         </w:rPr>
       </w:pPr>
-      <w:hyperlink w:anchor="_Toc243212137" w:history="1">
+      <w:hyperlink w:anchor="_Toc243245968" w:history="1">
         <w:r>
           <w:rPr>
             <w:rStyle w:val="Hyperlink"/>
@@ -1555,7 +1555,7 @@
             <w:noProof/>
             <w:webHidden/>
           </w:rPr>
-          <w:instrText xml:space="preserve"> PAGEREF _Toc243212137 \h </w:instrText>
+          <w:instrText xml:space="preserve"> PAGEREF _Toc243245968 \h </w:instrText>
         </w:r>
         <w:r>
           <w:rPr>
@@ -1603,7 +1603,7 @@
           <w14:ligatures w14:val="standardContextual"/>
         </w:rPr>
       </w:pPr>
-      <w:hyperlink w:anchor="_Toc243212138" w:history="1">
+      <w:hyperlink w:anchor="_Toc243245969" w:history="1">
         <w:r>
           <w:rPr>
             <w:rStyle w:val="Hyperlink"/>
@@ -1630,7 +1630,7 @@
             <w:noProof/>
             <w:webHidden/>
           </w:rPr>
-          <w:instrText xml:space="preserve"> PAGEREF _Toc243212138 \h </w:instrText>
+          <w:instrText xml:space="preserve"> PAGEREF _Toc243245969 \h </w:instrText>
         </w:r>
         <w:r>
           <w:rPr>
@@ -1678,7 +1678,7 @@
           <w14:ligatures w14:val="standardContextual"/>
         </w:rPr>
       </w:pPr>
-      <w:hyperlink w:anchor="_Toc243212139" w:history="1">
+      <w:hyperlink w:anchor="_Toc243245970" w:history="1">
         <w:r>
           <w:rPr>
             <w:rStyle w:val="Hyperlink"/>
@@ -1705,7 +1705,7 @@
             <w:noProof/>
             <w:webHidden/>
           </w:rPr>
-          <w:instrText xml:space="preserve"> PAGEREF _Toc243212139 \h </w:instrText>
+          <w:instrText xml:space="preserve"> PAGEREF _Toc243245970 \h </w:instrText>
         </w:r>
         <w:r>
           <w:rPr>
@@ -1753,7 +1753,7 @@
           <w14:ligatures w14:val="standardContextual"/>
         </w:rPr>
       </w:pPr>
-      <w:hyperlink w:anchor="_Toc243212140" w:history="1">
+      <w:hyperlink w:anchor="_Toc243245971" w:history="1">
         <w:r>
           <w:rPr>
             <w:rStyle w:val="Hyperlink"/>
@@ -1780,7 +1780,7 @@
             <w:noProof/>
             <w:webHidden/>
           </w:rPr>
-          <w:instrText xml:space="preserve"> PAGEREF _Toc243212140 \h </w:instrText>
+          <w:instrText xml:space="preserve"> PAGEREF _Toc243245971 \h </w:instrText>
         </w:r>
         <w:r>
           <w:rPr>
@@ -1828,7 +1828,7 @@
           <w14:ligatures w14:val="standardContextual"/>
         </w:rPr>
       </w:pPr>
-      <w:hyperlink w:anchor="_Toc243212141" w:history="1">
+      <w:hyperlink w:anchor="_Toc243245972" w:history="1">
         <w:r>
           <w:rPr>
             <w:rStyle w:val="Hyperlink"/>
@@ -1855,7 +1855,7 @@
             <w:noProof/>
             <w:webHidden/>
           </w:rPr>
-          <w:instrText xml:space="preserve"> PAGEREF _Toc243212141 \h </w:instrText>
+          <w:instrText xml:space="preserve"> PAGEREF _Toc243245972 \h </w:instrText>
         </w:r>
         <w:r>
           <w:rPr>
@@ -1903,7 +1903,7 @@
           <w14:ligatures w14:val="standardContextual"/>
         </w:rPr>
       </w:pPr>
-      <w:hyperlink w:anchor="_Toc243212142" w:history="1">
+      <w:hyperlink w:anchor="_Toc243245973" w:history="1">
         <w:r>
           <w:rPr>
             <w:rStyle w:val="Hyperlink"/>
@@ -1930,7 +1930,7 @@
             <w:noProof/>
             <w:webHidden/>
           </w:rPr>
-          <w:instrText xml:space="preserve"> PAGEREF _Toc243212142 \h </w:instrText>
+          <w:instrText xml:space="preserve"> PAGEREF _Toc243245973 \h </w:instrText>
         </w:r>
         <w:r>
           <w:rPr>
@@ -1978,7 +1978,7 @@
           <w14:ligatures w14:val="standardContextual"/>
         </w:rPr>
       </w:pPr>
-      <w:hyperlink w:anchor="_Toc243212143" w:history="1">
+      <w:hyperlink w:anchor="_Toc243245974" w:history="1">
         <w:r>
           <w:rPr>
             <w:rStyle w:val="Hyperlink"/>
@@ -2005,7 +2005,7 @@
             <w:noProof/>
             <w:webHidden/>
           </w:rPr>
-          <w:instrText xml:space="preserve"> PAGEREF _Toc243212143 \h </w:instrText>
+          <w:instrText xml:space="preserve"> PAGEREF _Toc243245974 \h </w:instrText>
         </w:r>
         <w:r>
           <w:rPr>
@@ -2053,7 +2053,7 @@
           <w14:ligatures w14:val="standardContextual"/>
         </w:rPr>
       </w:pPr>
-      <w:hyperlink w:anchor="_Toc243212144" w:history="1">
+      <w:hyperlink w:anchor="_Toc243245975" w:history="1">
         <w:r>
           <w:rPr>
             <w:rStyle w:val="Hyperlink"/>
@@ -2080,7 +2080,7 @@
             <w:noProof/>
             <w:webHidden/>
           </w:rPr>
-          <w:instrText xml:space="preserve"> PAGEREF _Toc243212144 \h </w:instrText>
+          <w:instrText xml:space="preserve"> PAGEREF _Toc243245975 \h </w:instrText>
         </w:r>
         <w:r>
           <w:rPr>
@@ -2128,7 +2128,7 @@
           <w14:ligatures w14:val="standardContextual"/>
         </w:rPr>
       </w:pPr>
-      <w:hyperlink w:anchor="_Toc243212145" w:history="1">
+      <w:hyperlink w:anchor="_Toc243245976" w:history="1">
         <w:r>
           <w:rPr>
             <w:rStyle w:val="Hyperlink"/>
@@ -2155,7 +2155,7 @@
             <w:noProof/>
             <w:webHidden/>
           </w:rPr>
-          <w:instrText xml:space="preserve"> PAGEREF _Toc243212145 \h </w:instrText>
+          <w:instrText xml:space="preserve"> PAGEREF _Toc243245976 \h </w:instrText>
         </w:r>
         <w:r>
           <w:rPr>
@@ -2203,7 +2203,7 @@
           <w14:ligatures w14:val="standardContextual"/>
         </w:rPr>
       </w:pPr>
-      <w:hyperlink w:anchor="_Toc243212146" w:history="1">
+      <w:hyperlink w:anchor="_Toc243245977" w:history="1">
         <w:r>
           <w:rPr>
             <w:rStyle w:val="Hyperlink"/>
@@ -2230,7 +2230,7 @@
             <w:noProof/>
             <w:webHidden/>
           </w:rPr>
-          <w:instrText xml:space="preserve"> PAGEREF _Toc243212146 \h </w:instrText>
+          <w:instrText xml:space="preserve"> PAGEREF _Toc243245977 \h </w:instrText>
         </w:r>
         <w:r>
           <w:rPr>
@@ -2278,7 +2278,7 @@
           <w14:ligatures w14:val="standardContextual"/>
         </w:rPr>
       </w:pPr>
-      <w:hyperlink w:anchor="_Toc243212147" w:history="1">
+      <w:hyperlink w:anchor="_Toc243245978" w:history="1">
         <w:r>
           <w:rPr>
             <w:rStyle w:val="Hyperlink"/>
@@ -2305,7 +2305,7 @@
             <w:noProof/>
             <w:webHidden/>
           </w:rPr>
-          <w:instrText xml:space="preserve"> PAGEREF _Toc243212147 \h </w:instrText>
+          <w:instrText xml:space="preserve"> PAGEREF _Toc243245978 \h </w:instrText>
         </w:r>
         <w:r>
           <w:rPr>
@@ -2353,7 +2353,7 @@
           <w14:ligatures w14:val="standardContextual"/>
         </w:rPr>
       </w:pPr>
-      <w:hyperlink w:anchor="_Toc243212148" w:history="1">
+      <w:hyperlink w:anchor="_Toc243245979" w:history="1">
         <w:r>
           <w:rPr>
             <w:rStyle w:val="Hyperlink"/>
@@ -2380,7 +2380,7 @@
             <w:noProof/>
             <w:webHidden/>
           </w:rPr>
-          <w:instrText xml:space="preserve"> PAGEREF _Toc243212148 \h </w:instrText>
+          <w:instrText xml:space="preserve"> PAGEREF _Toc243245979 \h </w:instrText>
         </w:r>
         <w:r>
           <w:rPr>
@@ -2428,7 +2428,7 @@
           <w14:ligatures w14:val="standardContextual"/>
         </w:rPr>
       </w:pPr>
-      <w:hyperlink w:anchor="_Toc243212149" w:history="1">
+      <w:hyperlink w:anchor="_Toc243245980" w:history="1">
         <w:r>
           <w:rPr>
             <w:rStyle w:val="Hyperlink"/>
@@ -2455,7 +2455,7 @@
             <w:noProof/>
             <w:webHidden/>
           </w:rPr>
-          <w:instrText xml:space="preserve"> PAGEREF _Toc243212149 \h </w:instrText>
+          <w:instrText xml:space="preserve"> PAGEREF _Toc243245980 \h </w:instrText>
         </w:r>
         <w:r>
           <w:rPr>
@@ -2503,7 +2503,7 @@
           <w14:ligatures w14:val="standardContextual"/>
         </w:rPr>
       </w:pPr>
-      <w:hyperlink w:anchor="_Toc243212150" w:history="1">
+      <w:hyperlink w:anchor="_Toc243245981" w:history="1">
         <w:r>
           <w:rPr>
             <w:rStyle w:val="Hyperlink"/>
@@ -2530,7 +2530,7 @@
             <w:noProof/>
             <w:webHidden/>
           </w:rPr>
-          <w:instrText xml:space="preserve"> PAGEREF _Toc243212150 \h </w:instrText>
+          <w:instrText xml:space="preserve"> PAGEREF _Toc243245981 \h </w:instrText>
         </w:r>
         <w:r>
           <w:rPr>
@@ -2578,7 +2578,7 @@
           <w14:ligatures w14:val="standardContextual"/>
         </w:rPr>
       </w:pPr>
-      <w:hyperlink w:anchor="_Toc243212151" w:history="1">
+      <w:hyperlink w:anchor="_Toc243245982" w:history="1">
         <w:r>
           <w:rPr>
             <w:rStyle w:val="Hyperlink"/>
@@ -2605,7 +2605,7 @@
             <w:noProof/>
             <w:webHidden/>
           </w:rPr>
-          <w:instrText xml:space="preserve"> PAGEREF _Toc243212151 \h </w:instrText>
+          <w:instrText xml:space="preserve"> PAGEREF _Toc243245982 \h </w:instrText>
         </w:r>
         <w:r>
           <w:rPr>
@@ -2653,7 +2653,7 @@
           <w14:ligatures w14:val="standardContextual"/>
         </w:rPr>
       </w:pPr>
-      <w:hyperlink w:anchor="_Toc243212152" w:history="1">
+      <w:hyperlink w:anchor="_Toc243245983" w:history="1">
         <w:r>
           <w:rPr>
             <w:rStyle w:val="Hyperlink"/>
@@ -2680,7 +2680,7 @@
             <w:noProof/>
             <w:webHidden/>
           </w:rPr>
-          <w:instrText xml:space="preserve"> PAGEREF _Toc243212152 \h </w:instrText>
+          <w:instrText xml:space="preserve"> PAGEREF _Toc243245983 \h </w:instrText>
         </w:r>
         <w:r>
           <w:rPr>
@@ -2725,7 +2725,7 @@
       <w:pPr>
         <w:pStyle w:val="Heading1"/>
       </w:pPr>
-      <w:bookmarkStart w:id="0" w:name="_Toc243212122"/>
+      <w:bookmarkStart w:id="0" w:name="_Toc243245953"/>
       <w:r>
         <w:t>Document Revision History</w:t>
       </w:r>
@@ -4114,7 +4114,7 @@
       <w:pPr>
         <w:pStyle w:val="Heading1"/>
       </w:pPr>
-      <w:bookmarkStart w:id="1" w:name="_Toc243212123"/>
+      <w:bookmarkStart w:id="1" w:name="_Toc243245954"/>
       <w:r>
         <w:t>1. Introduction</w:t>
       </w:r>
@@ -4124,7 +4124,7 @@
       <w:pPr>
         <w:pStyle w:val="Heading2"/>
       </w:pPr>
-      <w:bookmarkStart w:id="2" w:name="_Toc243212124"/>
+      <w:bookmarkStart w:id="2" w:name="_Toc243245955"/>
       <w:r>
         <w:t>1.1 Purpose</w:t>
       </w:r>
@@ -4148,7 +4148,7 @@
       <w:pPr>
         <w:pStyle w:val="Heading2"/>
       </w:pPr>
-      <w:bookmarkStart w:id="3" w:name="_Toc243212125"/>
+      <w:bookmarkStart w:id="3" w:name="_Toc243245956"/>
       <w:r>
         <w:t>1.2 Scope and Pedagogical Boundaries</w:t>
       </w:r>
@@ -4420,7 +4420,7 @@
       <w:pPr>
         <w:pStyle w:val="Heading2"/>
       </w:pPr>
-      <w:bookmarkStart w:id="4" w:name="_Toc243212126"/>
+      <w:bookmarkStart w:id="4" w:name="_Toc243245957"/>
       <w:r>
         <w:t>1.3 Definitions, Acronyms, and Abbreviations</w:t>
       </w:r>
@@ -4784,7 +4784,7 @@
       <w:pPr>
         <w:pStyle w:val="Heading2"/>
       </w:pPr>
-      <w:bookmarkStart w:id="5" w:name="_Toc243212127"/>
+      <w:bookmarkStart w:id="5" w:name="_Toc243245958"/>
       <w:r>
         <w:t>1.4 References</w:t>
       </w:r>
@@ -4974,7 +4974,7 @@
       <w:pPr>
         <w:pStyle w:val="Heading1"/>
       </w:pPr>
-      <w:bookmarkStart w:id="6" w:name="_Toc243212128"/>
+      <w:bookmarkStart w:id="6" w:name="_Toc243245959"/>
       <w:r>
         <w:t>2. Overall Description</w:t>
       </w:r>
@@ -4984,7 +4984,7 @@
       <w:pPr>
         <w:pStyle w:val="Heading2"/>
       </w:pPr>
-      <w:bookmarkStart w:id="7" w:name="_Toc243212129"/>
+      <w:bookmarkStart w:id="7" w:name="_Toc243245960"/>
       <w:r>
         <w:t>2.1 Product Perspective &amp; System Context</w:t>
       </w:r>
@@ -5109,7 +5109,7 @@
       <w:pPr>
         <w:pStyle w:val="Heading2"/>
       </w:pPr>
-      <w:bookmarkStart w:id="8" w:name="_Toc243212130"/>
+      <w:bookmarkStart w:id="8" w:name="_Toc243245961"/>
       <w:r>
         <w:t>2.2 User Characteristics and Personas</w:t>
       </w:r>
@@ -5191,7 +5191,7 @@
       <w:pPr>
         <w:pStyle w:val="Heading2"/>
       </w:pPr>
-      <w:bookmarkStart w:id="9" w:name="_Toc243212131"/>
+      <w:bookmarkStart w:id="9" w:name="_Toc243245962"/>
       <w:r>
         <w:t>2.3 General Constraints &amp; Policies</w:t>
       </w:r>
@@ -5295,7 +5295,7 @@
       <w:pPr>
         <w:pStyle w:val="Heading2"/>
       </w:pPr>
-      <w:bookmarkStart w:id="10" w:name="_Toc243212132"/>
+      <w:bookmarkStart w:id="10" w:name="_Toc243245963"/>
       <w:r>
         <w:t>2.4 Assumptions and Dependencies</w:t>
       </w:r>
@@ -5371,7 +5371,7 @@
         <w:pStyle w:val="Heading2"/>
         <w:pageBreakBefore/>
       </w:pPr>
-      <w:bookmarkStart w:id="11" w:name="_Toc243212133"/>
+      <w:bookmarkStart w:id="11" w:name="_Toc243245964"/>
       <w:r>
         <w:t>2.5 Use Case Model</w:t>
       </w:r>
@@ -5501,7 +5501,7 @@
           <w:noProof/>
         </w:rPr>
         <w:drawing>
-          <wp:inline distT="0" distB="0" distL="0" distR="0" wp14:anchorId="13D14A18" wp14:editId="5F142979">
+          <wp:inline distT="0" distB="0" distL="0" distR="0" wp14:anchorId="0757140A" wp14:editId="32A880B3">
             <wp:extent cx="3203455" cy="5394960"/>
             <wp:effectExtent l="0" t="0" r="0" b="0"/>
             <wp:docPr id="2" name="Picture 2"/>
@@ -5564,7 +5564,7 @@
       <w:pPr>
         <w:pStyle w:val="Heading1"/>
       </w:pPr>
-      <w:bookmarkStart w:id="12" w:name="_Toc243212134"/>
+      <w:bookmarkStart w:id="12" w:name="_Toc243245965"/>
       <w:r>
         <w:t>3. Specific Requirements</w:t>
       </w:r>
@@ -5574,7 +5574,7 @@
       <w:pPr>
         <w:pStyle w:val="Heading2"/>
       </w:pPr>
-      <w:bookmarkStart w:id="13" w:name="_Toc243212135"/>
+      <w:bookmarkStart w:id="13" w:name="_Toc243245966"/>
       <w:r>
         <w:t>3.1 External Interface Requirements</w:t>
       </w:r>
@@ -5584,7 +5584,7 @@
       <w:pPr>
         <w:pStyle w:val="Heading3"/>
       </w:pPr>
-      <w:bookmarkStart w:id="14" w:name="_Toc243212136"/>
+      <w:bookmarkStart w:id="14" w:name="_Toc243245967"/>
       <w:r>
         <w:t>3.1.1 Hardware Interfaces</w:t>
       </w:r>
@@ -5642,7 +5642,7 @@
       <w:pPr>
         <w:pStyle w:val="Heading3"/>
       </w:pPr>
-      <w:bookmarkStart w:id="15" w:name="_Toc243212137"/>
+      <w:bookmarkStart w:id="15" w:name="_Toc243245968"/>
       <w:r>
         <w:t>3.1.2 Software Interfaces</w:t>
       </w:r>
@@ -5770,7 +5770,7 @@
       <w:pPr>
         <w:pStyle w:val="Heading3"/>
       </w:pPr>
-      <w:bookmarkStart w:id="16" w:name="_Toc243212138"/>
+      <w:bookmarkStart w:id="16" w:name="_Toc243245969"/>
       <w:r>
         <w:t>3.1.3 Communications Interfaces</w:t>
       </w:r>
@@ -5798,7 +5798,7 @@
       <w:pPr>
         <w:pStyle w:val="Heading2"/>
       </w:pPr>
-      <w:bookmarkStart w:id="17" w:name="_Toc243212139"/>
+      <w:bookmarkStart w:id="17" w:name="_Toc243245970"/>
       <w:r>
         <w:t>3.2 Refactored Functional Requirements (FR)</w:t>
       </w:r>
@@ -5808,7 +5808,7 @@
       <w:pPr>
         <w:pStyle w:val="Heading3"/>
       </w:pPr>
-      <w:bookmarkStart w:id="18" w:name="_Toc243212140"/>
+      <w:bookmarkStart w:id="18" w:name="_Toc243245971"/>
       <w:r>
         <w:t>Module 1: Letter-Sound Acquisition ("Hear It")</w:t>
       </w:r>
@@ -6386,7 +6386,7 @@
       <w:pPr>
         <w:pStyle w:val="Heading3"/>
       </w:pPr>
-      <w:bookmarkStart w:id="19" w:name="_Toc243212141"/>
+      <w:bookmarkStart w:id="19" w:name="_Toc243245972"/>
       <w:r>
         <w:t>Module 2: Speech Production &amp; Formative Tutoring ("Say It")</w:t>
       </w:r>
@@ -7141,7 +7141,7 @@
       <w:pPr>
         <w:pStyle w:val="Heading3"/>
       </w:pPr>
-      <w:bookmarkStart w:id="20" w:name="_Toc243212142"/>
+      <w:bookmarkStart w:id="20" w:name="_Toc243245973"/>
       <w:r>
         <w:t>Module 3: Phoneme Discrimination ("Find It")</w:t>
       </w:r>
@@ -7263,7 +7263,7 @@
       <w:pPr>
         <w:pStyle w:val="Heading3"/>
       </w:pPr>
-      <w:bookmarkStart w:id="21" w:name="_Toc243212143"/>
+      <w:bookmarkStart w:id="21" w:name="_Toc243245974"/>
       <w:r>
         <w:t>Module 4: Word Construction Checkpoint ("Blend It")</w:t>
       </w:r>
@@ -7715,7 +7715,7 @@
       <w:pPr>
         <w:pStyle w:val="Heading3"/>
       </w:pPr>
-      <w:bookmarkStart w:id="22" w:name="_Toc243212144"/>
+      <w:bookmarkStart w:id="22" w:name="_Toc243245975"/>
       <w:r>
         <w:t>Module 5: Mastery Progression, Gamification &amp; Multi-Profile</w:t>
       </w:r>
@@ -8074,7 +8074,7 @@
       <w:pPr>
         <w:pStyle w:val="Heading3"/>
       </w:pPr>
-      <w:bookmarkStart w:id="23" w:name="_Toc243212145"/>
+      <w:bookmarkStart w:id="23" w:name="_Toc243245976"/>
       <w:r>
         <w:t>Module 6: Telemetry, Parent Dashboard &amp; Diagnostics</w:t>
       </w:r>
@@ -8625,7 +8625,7 @@
       <w:pPr>
         <w:pStyle w:val="Heading2"/>
       </w:pPr>
-      <w:bookmarkStart w:id="24" w:name="_Toc243212146"/>
+      <w:bookmarkStart w:id="24" w:name="_Toc243245977"/>
       <w:r>
         <w:t>3.3 Non-Functional Requirements (NFR)</w:t>
       </w:r>
@@ -8635,7 +8635,7 @@
       <w:pPr>
         <w:pStyle w:val="Heading3"/>
       </w:pPr>
-      <w:bookmarkStart w:id="25" w:name="_Toc243212147"/>
+      <w:bookmarkStart w:id="25" w:name="_Toc243245978"/>
       <w:r>
         <w:t>3.3.1 Acoustic Quality &amp; Speech Recognition Performance</w:t>
       </w:r>
@@ -8688,7 +8688,7 @@
         <w:t>Audio assets shall be generated using the Kokoro-82M neural model (Apache-2.0). Held (continuous) sounds may instead use Chatterbox-Turbo (MIT), voice-cloned from a Kokoro reference clip, chosen per clip by ear (team decision 2026-10-01). Short vowels may instead be a team member's recordings voice-converted with ElevenLabs (team decision 2026-10-08). The Blend It words AM, TUB and YAM and the short /i/ were made with ElevenLabs Text to Speech after the Kokoro and earlier synthetic takes failed review (team</w:t>
       </w:r>
       <w:r>
-        <w:t xml:space="preserve"> decisions 2026-10-11 and 2026-10-12). These are Free-plan clips: non-commercial use only, and the app credits "elevenlabs.io" in the Parent Zone.</w:t>
+        <w:t xml:space="preserve"> decisions 2026-10-11 and 2026-10-12, adviser confirmation pending). These are Free-plan clips: non-commercial use only, and the app credits "elevenlabs.io" in the Parent Zone.</w:t>
       </w:r>
     </w:p>
     <w:p>
@@ -9132,7 +9132,7 @@
       <w:pPr>
         <w:pStyle w:val="Heading3"/>
       </w:pPr>
-      <w:bookmarkStart w:id="26" w:name="_Toc243212148"/>
+      <w:bookmarkStart w:id="26" w:name="_Toc243245979"/>
       <w:r>
         <w:t>3.3.2 Pedagogical Usability &amp; Accessibility</w:t>
       </w:r>
@@ -9513,7 +9513,7 @@
       <w:pPr>
         <w:pStyle w:val="Heading3"/>
       </w:pPr>
-      <w:bookmarkStart w:id="27" w:name="_Toc243212149"/>
+      <w:bookmarkStart w:id="27" w:name="_Toc243245980"/>
       <w:r>
         <w:t>3.3.3 Reliability, Offline Security &amp; Architecture</w:t>
       </w:r>
@@ -9633,7 +9633,7 @@
       <w:pPr>
         <w:pStyle w:val="Heading1"/>
       </w:pPr>
-      <w:bookmarkStart w:id="28" w:name="_Toc243212150"/>
+      <w:bookmarkStart w:id="28" w:name="_Toc243245981"/>
       <w:r>
         <w:t>4. Requirements Traceability Matrix (RTM v3.0)</w:t>
       </w:r>
@@ -13083,7 +13083,7 @@
       <w:pPr>
         <w:pStyle w:val="Heading2"/>
       </w:pPr>
-      <w:bookmarkStart w:id="29" w:name="_Toc243212151"/>
+      <w:bookmarkStart w:id="29" w:name="_Toc243245982"/>
       <w:r>
         <w:t>4.1 Automated Test Coverage of Refactored Requirements (RTM v3.3, checked 2026-10-14)</w:t>
       </w:r>
@@ -14786,7 +14786,7 @@
       <w:pPr>
         <w:pStyle w:val="Heading1"/>
       </w:pPr>
-      <w:bookmarkStart w:id="30" w:name="_Toc243212152"/>
+      <w:bookmarkStart w:id="30" w:name="_Toc243245983"/>
       <w:r>
         <w:t>5. Requirements Sign-Off &amp; Verification Protocol</w:t>
       </w:r>
@@ -15287,31 +15287,31 @@
       </w:rPr>
     </w:lvl>
   </w:abstractNum>
-  <w:num w:numId="1" w16cid:durableId="1858807641">
+  <w:num w:numId="1" w16cid:durableId="1876192091">
     <w:abstractNumId w:val="8"/>
   </w:num>
-  <w:num w:numId="2" w16cid:durableId="1241332026">
+  <w:num w:numId="2" w16cid:durableId="1880245316">
     <w:abstractNumId w:val="6"/>
   </w:num>
-  <w:num w:numId="3" w16cid:durableId="73547905">
+  <w:num w:numId="3" w16cid:durableId="33506700">
     <w:abstractNumId w:val="5"/>
   </w:num>
-  <w:num w:numId="4" w16cid:durableId="1097366900">
+  <w:num w:numId="4" w16cid:durableId="1081296653">
     <w:abstractNumId w:val="4"/>
   </w:num>
-  <w:num w:numId="5" w16cid:durableId="1028095098">
+  <w:num w:numId="5" w16cid:durableId="1176338426">
     <w:abstractNumId w:val="7"/>
   </w:num>
-  <w:num w:numId="6" w16cid:durableId="1598907757">
+  <w:num w:numId="6" w16cid:durableId="628438918">
     <w:abstractNumId w:val="3"/>
   </w:num>
-  <w:num w:numId="7" w16cid:durableId="296306068">
+  <w:num w:numId="7" w16cid:durableId="1846704096">
     <w:abstractNumId w:val="2"/>
   </w:num>
-  <w:num w:numId="8" w16cid:durableId="1294410238">
+  <w:num w:numId="8" w16cid:durableId="2030179232">
     <w:abstractNumId w:val="1"/>
   </w:num>
-  <w:num w:numId="9" w16cid:durableId="1820342335">
+  <w:num w:numId="9" w16cid:durableId="1247029920">
     <w:abstractNumId w:val="0"/>
   </w:num>
 </w:numbering>
@@ -26706,7 +26706,7 @@
     <w:autoRedefine/>
     <w:uiPriority w:val="39"/>
     <w:unhideWhenUsed/>
-    <w:rsid w:val="005125A8"/>
+    <w:rsid w:val="003C3EE9"/>
     <w:pPr>
       <w:spacing w:after="100"/>
     </w:pPr>
@@ -26718,7 +26718,7 @@
     <w:autoRedefine/>
     <w:uiPriority w:val="39"/>
     <w:unhideWhenUsed/>
-    <w:rsid w:val="005125A8"/>
+    <w:rsid w:val="003C3EE9"/>
     <w:pPr>
       <w:spacing w:after="100"/>
       <w:ind w:left="200"/>
@@ -26731,7 +26731,7 @@
     <w:autoRedefine/>
     <w:uiPriority w:val="39"/>
     <w:unhideWhenUsed/>
-    <w:rsid w:val="005125A8"/>
+    <w:rsid w:val="003C3EE9"/>
     <w:pPr>
       <w:spacing w:after="100"/>
       <w:ind w:left="400"/>
@@ -26742,7 +26742,7 @@
     <w:basedOn w:val="DefaultParagraphFont"/>
     <w:uiPriority w:val="99"/>
     <w:unhideWhenUsed/>
-    <w:rsid w:val="005125A8"/>
+    <w:rsid w:val="003C3EE9"/>
     <w:rPr>
       <w:color w:val="0000FF" w:themeColor="hyperlink"/>
       <w:u w:val="single"/>

</xml_diff>